<commit_message>
dashboard enhancements project history tab fixes scenario tab added
</commit_message>
<xml_diff>
--- a/TO DOs.docx
+++ b/TO DOs.docx
@@ -520,6 +520,790 @@
     <w:p/>
     <w:p/>
     <w:p/>
+    <w:p/>
+    <w:p>
+      <w:pPr>
+        <w:tabs>
+          <w:tab w:val="left" w:pos="6645"/>
+        </w:tabs>
+      </w:pPr>
+      <w:r>
+        <w:tab/>
+      </w:r>
+      <w:proofErr w:type="spellStart"/>
+      <w:r>
+        <w:t>Scenario</w:t>
+      </w:r>
+      <w:proofErr w:type="spellEnd"/>
+      <w:r>
+        <w:tab/>
+        <w:t>Value</w:t>
+      </w:r>
+    </w:p>
+    <w:p>
+      <w:pPr>
+        <w:tabs>
+          <w:tab w:val="left" w:pos="6645"/>
+        </w:tabs>
+      </w:pPr>
+      <w:r>
+        <w:t>1</w:t>
+      </w:r>
+      <w:r>
+        <w:tab/>
+      </w:r>
+      <w:proofErr w:type="spellStart"/>
+      <w:r>
+        <w:t>Month-over-Month</w:t>
+      </w:r>
+      <w:proofErr w:type="spellEnd"/>
+      <w:r>
+        <w:t xml:space="preserve"> Trend - Select </w:t>
+      </w:r>
+      <w:proofErr w:type="spellStart"/>
+      <w:r>
+        <w:t>current</w:t>
+      </w:r>
+      <w:proofErr w:type="spellEnd"/>
+      <w:r>
+        <w:t xml:space="preserve"> + </w:t>
+      </w:r>
+      <w:proofErr w:type="spellStart"/>
+      <w:r>
+        <w:t>previous</w:t>
+      </w:r>
+      <w:proofErr w:type="spellEnd"/>
+      <w:r>
+        <w:t xml:space="preserve"> </w:t>
+      </w:r>
+      <w:proofErr w:type="spellStart"/>
+      <w:r>
+        <w:t>month</w:t>
+      </w:r>
+      <w:proofErr w:type="spellEnd"/>
+      <w:r>
+        <w:t xml:space="preserve">, </w:t>
+      </w:r>
+      <w:proofErr w:type="spellStart"/>
+      <w:r>
+        <w:t>show</w:t>
+      </w:r>
+      <w:proofErr w:type="spellEnd"/>
+      <w:r>
+        <w:t xml:space="preserve"> % </w:t>
+      </w:r>
+      <w:proofErr w:type="spellStart"/>
+      <w:r>
+        <w:t>change</w:t>
+      </w:r>
+      <w:proofErr w:type="spellEnd"/>
+      <w:r>
+        <w:t xml:space="preserve"> Δ</w:t>
+      </w:r>
+      <w:r>
+        <w:tab/>
+      </w:r>
+      <w:proofErr w:type="spellStart"/>
+      <w:r>
+        <w:t>Quick</w:t>
+      </w:r>
+      <w:proofErr w:type="spellEnd"/>
+      <w:r>
+        <w:t xml:space="preserve"> delta </w:t>
+      </w:r>
+      <w:proofErr w:type="spellStart"/>
+      <w:r>
+        <w:t>visibility</w:t>
+      </w:r>
+      <w:proofErr w:type="spellEnd"/>
+    </w:p>
+    <w:p>
+      <w:pPr>
+        <w:tabs>
+          <w:tab w:val="left" w:pos="6645"/>
+        </w:tabs>
+      </w:pPr>
+      <w:r>
+        <w:t>2</w:t>
+      </w:r>
+      <w:r>
+        <w:tab/>
+        <w:t xml:space="preserve">BU </w:t>
+      </w:r>
+      <w:proofErr w:type="spellStart"/>
+      <w:r>
+        <w:t>Comparison</w:t>
+      </w:r>
+      <w:proofErr w:type="spellEnd"/>
+      <w:r>
+        <w:t xml:space="preserve"> </w:t>
+      </w:r>
+      <w:proofErr w:type="spellStart"/>
+      <w:r>
+        <w:t>View</w:t>
+      </w:r>
+      <w:proofErr w:type="spellEnd"/>
+      <w:r>
+        <w:t xml:space="preserve"> - Side-</w:t>
+      </w:r>
+      <w:proofErr w:type="spellStart"/>
+      <w:r>
+        <w:t>by</w:t>
+      </w:r>
+      <w:proofErr w:type="spellEnd"/>
+      <w:r>
+        <w:t>-</w:t>
+      </w:r>
+      <w:proofErr w:type="spellStart"/>
+      <w:r>
+        <w:t>side</w:t>
+      </w:r>
+      <w:proofErr w:type="spellEnd"/>
+      <w:r>
+        <w:t xml:space="preserve"> ENG/MC/T&amp;SI/NUC in </w:t>
+      </w:r>
+      <w:proofErr w:type="spellStart"/>
+      <w:r>
+        <w:t>one</w:t>
+      </w:r>
+      <w:proofErr w:type="spellEnd"/>
+      <w:r>
+        <w:t xml:space="preserve"> </w:t>
+      </w:r>
+      <w:proofErr w:type="spellStart"/>
+      <w:r>
+        <w:t>chart</w:t>
+      </w:r>
+      <w:proofErr w:type="spellEnd"/>
+      <w:r>
+        <w:tab/>
+      </w:r>
+      <w:proofErr w:type="spellStart"/>
+      <w:r>
+        <w:t>See</w:t>
+      </w:r>
+      <w:proofErr w:type="spellEnd"/>
+      <w:r>
+        <w:t xml:space="preserve"> BU </w:t>
+      </w:r>
+      <w:proofErr w:type="spellStart"/>
+      <w:r>
+        <w:t>balance</w:t>
+      </w:r>
+      <w:proofErr w:type="spellEnd"/>
+    </w:p>
+    <w:p>
+      <w:pPr>
+        <w:tabs>
+          <w:tab w:val="left" w:pos="6645"/>
+        </w:tabs>
+      </w:pPr>
+      <w:r>
+        <w:t>3</w:t>
+      </w:r>
+      <w:r>
+        <w:tab/>
+        <w:t xml:space="preserve">Interactive </w:t>
+      </w:r>
+      <w:proofErr w:type="spellStart"/>
+      <w:r>
+        <w:t>Filters</w:t>
+      </w:r>
+      <w:proofErr w:type="spellEnd"/>
+      <w:r>
+        <w:t xml:space="preserve"> - </w:t>
+      </w:r>
+      <w:proofErr w:type="spellStart"/>
+      <w:r>
+        <w:t>Filter</w:t>
+      </w:r>
+      <w:proofErr w:type="spellEnd"/>
+      <w:r>
+        <w:t xml:space="preserve"> </w:t>
+      </w:r>
+      <w:proofErr w:type="spellStart"/>
+      <w:r>
+        <w:t>by</w:t>
+      </w:r>
+      <w:proofErr w:type="spellEnd"/>
+      <w:r>
+        <w:t xml:space="preserve"> </w:t>
+      </w:r>
+      <w:proofErr w:type="spellStart"/>
+      <w:r>
+        <w:t>client</w:t>
+      </w:r>
+      <w:proofErr w:type="spellEnd"/>
+      <w:r>
+        <w:t>/</w:t>
+      </w:r>
+      <w:proofErr w:type="spellStart"/>
+      <w:r>
+        <w:t>project</w:t>
+      </w:r>
+      <w:proofErr w:type="spellEnd"/>
+      <w:r>
+        <w:t xml:space="preserve"> name</w:t>
+      </w:r>
+      <w:r>
+        <w:tab/>
+      </w:r>
+      <w:proofErr w:type="spellStart"/>
+      <w:r>
+        <w:t>Drill</w:t>
+      </w:r>
+      <w:proofErr w:type="spellEnd"/>
+      <w:r>
+        <w:t xml:space="preserve"> </w:t>
+      </w:r>
+      <w:proofErr w:type="spellStart"/>
+      <w:r>
+        <w:t>down</w:t>
+      </w:r>
+      <w:proofErr w:type="spellEnd"/>
+    </w:p>
+    <w:p>
+      <w:pPr>
+        <w:tabs>
+          <w:tab w:val="left" w:pos="6645"/>
+        </w:tabs>
+      </w:pPr>
+      <w:r>
+        <w:lastRenderedPageBreak/>
+        <w:t>4</w:t>
+      </w:r>
+      <w:r>
+        <w:tab/>
+        <w:t xml:space="preserve">YTD </w:t>
+      </w:r>
+      <w:proofErr w:type="spellStart"/>
+      <w:r>
+        <w:t>vs</w:t>
+      </w:r>
+      <w:proofErr w:type="spellEnd"/>
+      <w:r>
+        <w:t xml:space="preserve"> </w:t>
+      </w:r>
+      <w:proofErr w:type="spellStart"/>
+      <w:r>
+        <w:t>Target</w:t>
+      </w:r>
+      <w:proofErr w:type="spellEnd"/>
+      <w:r>
+        <w:t xml:space="preserve"> - </w:t>
+      </w:r>
+      <w:proofErr w:type="spellStart"/>
+      <w:r>
+        <w:t>Actual</w:t>
+      </w:r>
+      <w:proofErr w:type="spellEnd"/>
+      <w:r>
+        <w:t xml:space="preserve"> YTD </w:t>
+      </w:r>
+      <w:proofErr w:type="spellStart"/>
+      <w:r>
+        <w:t>vs</w:t>
+      </w:r>
+      <w:proofErr w:type="spellEnd"/>
+      <w:r>
+        <w:t xml:space="preserve"> 2026 </w:t>
+      </w:r>
+      <w:proofErr w:type="spellStart"/>
+      <w:r>
+        <w:t>Target</w:t>
+      </w:r>
+      <w:proofErr w:type="spellEnd"/>
+      <w:r>
+        <w:t xml:space="preserve"> </w:t>
+      </w:r>
+      <w:proofErr w:type="spellStart"/>
+      <w:r>
+        <w:t>progress</w:t>
+      </w:r>
+      <w:proofErr w:type="spellEnd"/>
+      <w:r>
+        <w:t xml:space="preserve"> bar</w:t>
+      </w:r>
+      <w:r>
+        <w:tab/>
+      </w:r>
+      <w:proofErr w:type="spellStart"/>
+      <w:r>
+        <w:t>Track</w:t>
+      </w:r>
+      <w:proofErr w:type="spellEnd"/>
+      <w:r>
+        <w:t xml:space="preserve"> </w:t>
+      </w:r>
+      <w:proofErr w:type="spellStart"/>
+      <w:r>
+        <w:t>to</w:t>
+      </w:r>
+      <w:proofErr w:type="spellEnd"/>
+      <w:r>
+        <w:t xml:space="preserve"> </w:t>
+      </w:r>
+      <w:proofErr w:type="spellStart"/>
+      <w:r>
+        <w:t>goals</w:t>
+      </w:r>
+      <w:proofErr w:type="spellEnd"/>
+    </w:p>
+    <w:p>
+      <w:pPr>
+        <w:tabs>
+          <w:tab w:val="left" w:pos="6645"/>
+        </w:tabs>
+      </w:pPr>
+      <w:r>
+        <w:t>5</w:t>
+      </w:r>
+      <w:r>
+        <w:tab/>
+        <w:t xml:space="preserve">WIP </w:t>
+      </w:r>
+      <w:proofErr w:type="spellStart"/>
+      <w:r>
+        <w:t>Aging</w:t>
+      </w:r>
+      <w:proofErr w:type="spellEnd"/>
+      <w:r>
+        <w:t xml:space="preserve"> - </w:t>
+      </w:r>
+      <w:proofErr w:type="spellStart"/>
+      <w:r>
+        <w:t>Group</w:t>
+      </w:r>
+      <w:proofErr w:type="spellEnd"/>
+      <w:r>
+        <w:t xml:space="preserve"> WIP </w:t>
+      </w:r>
+      <w:proofErr w:type="spellStart"/>
+      <w:r>
+        <w:t>by</w:t>
+      </w:r>
+      <w:proofErr w:type="spellEnd"/>
+      <w:r>
+        <w:t xml:space="preserve"> </w:t>
+      </w:r>
+      <w:proofErr w:type="spellStart"/>
+      <w:r>
+        <w:t>age</w:t>
+      </w:r>
+      <w:proofErr w:type="spellEnd"/>
+      <w:r>
+        <w:t xml:space="preserve"> </w:t>
+      </w:r>
+      <w:proofErr w:type="spellStart"/>
+      <w:r>
+        <w:t>bucket</w:t>
+      </w:r>
+      <w:proofErr w:type="spellEnd"/>
+      <w:r>
+        <w:t xml:space="preserve"> (&gt;90 </w:t>
+      </w:r>
+      <w:proofErr w:type="spellStart"/>
+      <w:r>
+        <w:t>days</w:t>
+      </w:r>
+      <w:proofErr w:type="spellEnd"/>
+      <w:r>
+        <w:t xml:space="preserve">, &gt;180 </w:t>
+      </w:r>
+      <w:proofErr w:type="spellStart"/>
+      <w:r>
+        <w:t>days</w:t>
+      </w:r>
+      <w:proofErr w:type="spellEnd"/>
+      <w:r>
+        <w:t>)</w:t>
+      </w:r>
+      <w:r>
+        <w:tab/>
+        <w:t xml:space="preserve">Risk </w:t>
+      </w:r>
+      <w:proofErr w:type="spellStart"/>
+      <w:r>
+        <w:t>flagging</w:t>
+      </w:r>
+      <w:proofErr w:type="spellEnd"/>
+    </w:p>
+    <w:p>
+      <w:pPr>
+        <w:tabs>
+          <w:tab w:val="left" w:pos="6645"/>
+        </w:tabs>
+      </w:pPr>
+      <w:r>
+        <w:t>6</w:t>
+      </w:r>
+      <w:r>
+        <w:tab/>
+      </w:r>
+      <w:proofErr w:type="spellStart"/>
+      <w:r>
+        <w:t>Export</w:t>
+      </w:r>
+      <w:proofErr w:type="spellEnd"/>
+      <w:r>
+        <w:t xml:space="preserve"> </w:t>
+      </w:r>
+      <w:proofErr w:type="spellStart"/>
+      <w:r>
+        <w:t>to</w:t>
+      </w:r>
+      <w:proofErr w:type="spellEnd"/>
+      <w:r>
+        <w:t xml:space="preserve"> Excel - </w:t>
+      </w:r>
+      <w:proofErr w:type="spellStart"/>
+      <w:r>
+        <w:t>Download</w:t>
+      </w:r>
+      <w:proofErr w:type="spellEnd"/>
+      <w:r>
+        <w:t xml:space="preserve"> </w:t>
+      </w:r>
+      <w:proofErr w:type="spellStart"/>
+      <w:r>
+        <w:t>filtered</w:t>
+      </w:r>
+      <w:proofErr w:type="spellEnd"/>
+      <w:r>
+        <w:t xml:space="preserve"> data </w:t>
+      </w:r>
+      <w:proofErr w:type="spellStart"/>
+      <w:r>
+        <w:t>to</w:t>
+      </w:r>
+      <w:proofErr w:type="spellEnd"/>
+      <w:r>
+        <w:t xml:space="preserve"> .</w:t>
+      </w:r>
+      <w:proofErr w:type="spellStart"/>
+      <w:r>
+        <w:t>xlsx</w:t>
+      </w:r>
+      <w:proofErr w:type="spellEnd"/>
+      <w:r>
+        <w:tab/>
+      </w:r>
+      <w:proofErr w:type="spellStart"/>
+      <w:r>
+        <w:t>Reporting</w:t>
+      </w:r>
+      <w:proofErr w:type="spellEnd"/>
+      <w:r>
+        <w:t xml:space="preserve"> </w:t>
+      </w:r>
+      <w:proofErr w:type="spellStart"/>
+      <w:r>
+        <w:t>backup</w:t>
+      </w:r>
+      <w:proofErr w:type="spellEnd"/>
+    </w:p>
+    <w:p>
+      <w:pPr>
+        <w:tabs>
+          <w:tab w:val="left" w:pos="6645"/>
+        </w:tabs>
+      </w:pPr>
+      <w:r>
+        <w:t>7</w:t>
+      </w:r>
+      <w:r>
+        <w:tab/>
+      </w:r>
+      <w:proofErr w:type="spellStart"/>
+      <w:r>
+        <w:t>Pipeline</w:t>
+      </w:r>
+      <w:proofErr w:type="spellEnd"/>
+      <w:r>
+        <w:t xml:space="preserve"> </w:t>
+      </w:r>
+      <w:proofErr w:type="spellStart"/>
+      <w:r>
+        <w:t>Health</w:t>
+      </w:r>
+      <w:proofErr w:type="spellEnd"/>
+      <w:r>
+        <w:t xml:space="preserve"> - </w:t>
+      </w:r>
+      <w:proofErr w:type="spellStart"/>
+      <w:r>
+        <w:t>Order</w:t>
+      </w:r>
+      <w:proofErr w:type="spellEnd"/>
+      <w:r>
+        <w:t xml:space="preserve"> → </w:t>
+      </w:r>
+      <w:proofErr w:type="spellStart"/>
+      <w:r>
+        <w:t>Offer</w:t>
+      </w:r>
+      <w:proofErr w:type="spellEnd"/>
+      <w:r>
+        <w:t xml:space="preserve"> → </w:t>
+      </w:r>
+      <w:proofErr w:type="spellStart"/>
+      <w:r>
+        <w:t>Converted</w:t>
+      </w:r>
+      <w:proofErr w:type="spellEnd"/>
+      <w:r>
+        <w:t xml:space="preserve"> </w:t>
+      </w:r>
+      <w:proofErr w:type="spellStart"/>
+      <w:r>
+        <w:t>rates</w:t>
+      </w:r>
+      <w:proofErr w:type="spellEnd"/>
+      <w:r>
+        <w:t xml:space="preserve"> </w:t>
+      </w:r>
+      <w:proofErr w:type="spellStart"/>
+      <w:r>
+        <w:t>per</w:t>
+      </w:r>
+      <w:proofErr w:type="spellEnd"/>
+      <w:r>
+        <w:t xml:space="preserve"> BU</w:t>
+      </w:r>
+      <w:r>
+        <w:tab/>
+      </w:r>
+      <w:proofErr w:type="spellStart"/>
+      <w:r>
+        <w:t>Sales</w:t>
+      </w:r>
+      <w:proofErr w:type="spellEnd"/>
+      <w:r>
+        <w:t xml:space="preserve"> </w:t>
+      </w:r>
+      <w:proofErr w:type="spellStart"/>
+      <w:r>
+        <w:t>funnel</w:t>
+      </w:r>
+      <w:proofErr w:type="spellEnd"/>
+    </w:p>
+    <w:p>
+      <w:pPr>
+        <w:tabs>
+          <w:tab w:val="left" w:pos="6645"/>
+        </w:tabs>
+      </w:pPr>
+      <w:r>
+        <w:t>8</w:t>
+      </w:r>
+      <w:r>
+        <w:tab/>
+      </w:r>
+      <w:proofErr w:type="spellStart"/>
+      <w:r>
+        <w:t>Currency</w:t>
+      </w:r>
+      <w:proofErr w:type="spellEnd"/>
+      <w:r>
+        <w:t xml:space="preserve"> </w:t>
+      </w:r>
+      <w:proofErr w:type="spellStart"/>
+      <w:r>
+        <w:t>Breakdown</w:t>
+      </w:r>
+      <w:proofErr w:type="spellEnd"/>
+      <w:r>
+        <w:t xml:space="preserve"> - WIP </w:t>
+      </w:r>
+      <w:proofErr w:type="spellStart"/>
+      <w:r>
+        <w:t>by</w:t>
+      </w:r>
+      <w:proofErr w:type="spellEnd"/>
+      <w:r>
+        <w:t xml:space="preserve"> </w:t>
+      </w:r>
+      <w:proofErr w:type="spellStart"/>
+      <w:r>
+        <w:t>original</w:t>
+      </w:r>
+      <w:proofErr w:type="spellEnd"/>
+      <w:r>
+        <w:t xml:space="preserve"> </w:t>
+      </w:r>
+      <w:proofErr w:type="spellStart"/>
+      <w:r>
+        <w:t>currency</w:t>
+      </w:r>
+      <w:proofErr w:type="spellEnd"/>
+      <w:r>
+        <w:t xml:space="preserve"> (EUR/USD/GBP)</w:t>
+      </w:r>
+      <w:r>
+        <w:tab/>
+        <w:t xml:space="preserve">FX risk </w:t>
+      </w:r>
+      <w:proofErr w:type="spellStart"/>
+      <w:r>
+        <w:t>view</w:t>
+      </w:r>
+      <w:proofErr w:type="spellEnd"/>
+    </w:p>
+    <w:p>
+      <w:pPr>
+        <w:tabs>
+          <w:tab w:val="left" w:pos="6645"/>
+        </w:tabs>
+      </w:pPr>
+      <w:r>
+        <w:t>9</w:t>
+      </w:r>
+      <w:r>
+        <w:tab/>
+        <w:t xml:space="preserve">Top 10 </w:t>
+      </w:r>
+      <w:proofErr w:type="spellStart"/>
+      <w:r>
+        <w:t>Clients</w:t>
+      </w:r>
+      <w:proofErr w:type="spellEnd"/>
+      <w:r>
+        <w:t xml:space="preserve"> - </w:t>
+      </w:r>
+      <w:proofErr w:type="spellStart"/>
+      <w:r>
+        <w:t>Sort</w:t>
+      </w:r>
+      <w:proofErr w:type="spellEnd"/>
+      <w:r>
+        <w:t xml:space="preserve"> </w:t>
+      </w:r>
+      <w:proofErr w:type="spellStart"/>
+      <w:r>
+        <w:t>by</w:t>
+      </w:r>
+      <w:proofErr w:type="spellEnd"/>
+      <w:r>
+        <w:t xml:space="preserve"> </w:t>
+      </w:r>
+      <w:proofErr w:type="spellStart"/>
+      <w:r>
+        <w:t>revenue</w:t>
+      </w:r>
+      <w:proofErr w:type="spellEnd"/>
+      <w:r>
+        <w:t xml:space="preserve">/WIP, </w:t>
+      </w:r>
+      <w:proofErr w:type="spellStart"/>
+      <w:r>
+        <w:t>show</w:t>
+      </w:r>
+      <w:proofErr w:type="spellEnd"/>
+      <w:r>
+        <w:t xml:space="preserve"> </w:t>
+      </w:r>
+      <w:proofErr w:type="spellStart"/>
+      <w:r>
+        <w:t>pie</w:t>
+      </w:r>
+      <w:proofErr w:type="spellEnd"/>
+      <w:r>
+        <w:t xml:space="preserve"> </w:t>
+      </w:r>
+      <w:proofErr w:type="spellStart"/>
+      <w:r>
+        <w:t>chart</w:t>
+      </w:r>
+      <w:proofErr w:type="spellEnd"/>
+      <w:r>
+        <w:tab/>
+      </w:r>
+      <w:proofErr w:type="spellStart"/>
+      <w:r>
+        <w:t>Key</w:t>
+      </w:r>
+      <w:proofErr w:type="spellEnd"/>
+      <w:r>
+        <w:t xml:space="preserve"> </w:t>
+      </w:r>
+      <w:proofErr w:type="spellStart"/>
+      <w:r>
+        <w:t>accounts</w:t>
+      </w:r>
+      <w:proofErr w:type="spellEnd"/>
+    </w:p>
+    <w:p>
+      <w:pPr>
+        <w:tabs>
+          <w:tab w:val="left" w:pos="6645"/>
+        </w:tabs>
+      </w:pPr>
+      <w:r>
+        <w:t>10</w:t>
+      </w:r>
+      <w:r>
+        <w:tab/>
+      </w:r>
+      <w:proofErr w:type="spellStart"/>
+      <w:r>
+        <w:t>YoY</w:t>
+      </w:r>
+      <w:proofErr w:type="spellEnd"/>
+      <w:r>
+        <w:t xml:space="preserve"> </w:t>
+      </w:r>
+      <w:proofErr w:type="spellStart"/>
+      <w:r>
+        <w:t>Comparison</w:t>
+      </w:r>
+      <w:proofErr w:type="spellEnd"/>
+      <w:r>
+        <w:t xml:space="preserve"> - </w:t>
+      </w:r>
+      <w:proofErr w:type="spellStart"/>
+      <w:r>
+        <w:t>Compare</w:t>
+      </w:r>
+      <w:proofErr w:type="spellEnd"/>
+      <w:r>
+        <w:t xml:space="preserve"> </w:t>
+      </w:r>
+      <w:proofErr w:type="spellStart"/>
+      <w:r>
+        <w:t>same</w:t>
+      </w:r>
+      <w:proofErr w:type="spellEnd"/>
+      <w:r>
+        <w:t xml:space="preserve"> </w:t>
+      </w:r>
+      <w:proofErr w:type="spellStart"/>
+      <w:r>
+        <w:t>month</w:t>
+      </w:r>
+      <w:proofErr w:type="spellEnd"/>
+      <w:r>
+        <w:t xml:space="preserve"> PY </w:t>
+      </w:r>
+      <w:proofErr w:type="spellStart"/>
+      <w:r>
+        <w:t>vs</w:t>
+      </w:r>
+      <w:proofErr w:type="spellEnd"/>
+      <w:r>
+        <w:t xml:space="preserve"> CY</w:t>
+      </w:r>
+      <w:r>
+        <w:tab/>
+      </w:r>
+      <w:proofErr w:type="spellStart"/>
+      <w:r>
+        <w:t>YoY</w:t>
+      </w:r>
+      <w:proofErr w:type="spellEnd"/>
+      <w:r>
+        <w:t xml:space="preserve"> trend</w:t>
+      </w:r>
+    </w:p>
     <w:sectPr>
       <w:pgSz w:w="11906" w:h="16838"/>
       <w:pgMar w:top="1417" w:right="1417" w:bottom="1417" w:left="1417" w:header="708" w:footer="708" w:gutter="0"/>
@@ -1370,7 +2154,6 @@
   <w:style w:type="character" w:default="1" w:styleId="DefaultParagraphFont">
     <w:name w:val="Default Paragraph Font"/>
     <w:uiPriority w:val="1"/>
-    <w:semiHidden/>
     <w:unhideWhenUsed/>
   </w:style>
   <w:style w:type="table" w:default="1" w:styleId="TableNormal">
@@ -2000,4 +2783,16 @@
     </a:ext>
   </a:extLst>
 </a:theme>
+</file>
+
+<file path=customXml/item1.xml><?xml version="1.0" encoding="utf-8"?>
+<b:Sources xmlns:b="http://schemas.openxmlformats.org/officeDocument/2006/bibliography" xmlns="http://schemas.openxmlformats.org/officeDocument/2006/bibliography" SelectedStyle="\APASixthEditionOfficeOnline.xsl" StyleName="APA" Version="6"/>
+</file>
+
+<file path=customXml/itemProps1.xml><?xml version="1.0" encoding="utf-8"?>
+<ds:datastoreItem xmlns:ds="http://schemas.openxmlformats.org/officeDocument/2006/customXml" ds:itemID="{913D10C6-E9B7-4D35-8400-2F83D022346B}">
+  <ds:schemaRefs>
+    <ds:schemaRef ds:uri="http://schemas.openxmlformats.org/officeDocument/2006/bibliography"/>
+  </ds:schemaRefs>
+</ds:datastoreItem>
 </file>
</xml_diff>

<commit_message>
report generating code abns 2nd box when needed
</commit_message>
<xml_diff>
--- a/TO DOs.docx
+++ b/TO DOs.docx
@@ -517,6 +517,327 @@
         <w:t xml:space="preserve"> BU konsolide raporlar</w:t>
       </w:r>
     </w:p>
+    <w:p>
+      <w:pPr>
+        <w:pStyle w:val="ListParagraph"/>
+        <w:numPr>
+          <w:ilvl w:val="0"/>
+          <w:numId w:val="1"/>
+        </w:numPr>
+        <w:shd w:val="clear" w:color="auto" w:fill="FFFFFF"/>
+        <w:spacing w:after="0" w:line="240" w:lineRule="auto"/>
+        <w:textAlignment w:val="baseline"/>
+        <w:rPr>
+          <w:rFonts w:ascii="Aptos" w:eastAsia="Times New Roman" w:hAnsi="Aptos" w:cs="Times New Roman"/>
+          <w:color w:val="000000"/>
+          <w:kern w:val="0"/>
+          <w:sz w:val="22"/>
+          <w:szCs w:val="22"/>
+          <w:lang w:eastAsia="tr-TR"/>
+          <w14:ligatures w14:val="none"/>
+        </w:rPr>
+      </w:pPr>
+      <w:r>
+        <w:rPr>
+          <w:rFonts w:ascii="Aptos" w:eastAsia="Times New Roman" w:hAnsi="Aptos" w:cs="Times New Roman"/>
+          <w:color w:val="000000"/>
+          <w:kern w:val="0"/>
+          <w:sz w:val="22"/>
+          <w:szCs w:val="22"/>
+          <w:lang w:eastAsia="tr-TR"/>
+          <w14:ligatures w14:val="none"/>
+        </w:rPr>
+        <w:t>Proje bazında son on iki ay vs. gibi karşılaştırmalı görüntüleme</w:t>
+      </w:r>
+    </w:p>
+    <w:p>
+      <w:pPr>
+        <w:pStyle w:val="ListParagraph"/>
+        <w:numPr>
+          <w:ilvl w:val="0"/>
+          <w:numId w:val="1"/>
+        </w:numPr>
+        <w:shd w:val="clear" w:color="auto" w:fill="FFFFFF"/>
+        <w:spacing w:after="0" w:line="240" w:lineRule="auto"/>
+        <w:textAlignment w:val="baseline"/>
+        <w:rPr>
+          <w:rFonts w:ascii="Aptos" w:eastAsia="Times New Roman" w:hAnsi="Aptos" w:cs="Times New Roman"/>
+          <w:color w:val="000000"/>
+          <w:kern w:val="0"/>
+          <w:sz w:val="22"/>
+          <w:szCs w:val="22"/>
+          <w:lang w:eastAsia="tr-TR"/>
+          <w14:ligatures w14:val="none"/>
+        </w:rPr>
+      </w:pPr>
+      <w:r>
+        <w:rPr>
+          <w:rFonts w:ascii="Aptos" w:eastAsia="Times New Roman" w:hAnsi="Aptos" w:cs="Times New Roman"/>
+          <w:color w:val="000000"/>
+          <w:kern w:val="0"/>
+          <w:sz w:val="22"/>
+          <w:szCs w:val="22"/>
+          <w:lang w:eastAsia="tr-TR"/>
+          <w14:ligatures w14:val="none"/>
+        </w:rPr>
+        <w:t>Ay bazında projeleri birbirleriyle, müşteri/proje bazlı, BU bazında çekilerek karşılaştırılabilir.</w:t>
+      </w:r>
+    </w:p>
+    <w:p>
+      <w:pPr>
+        <w:pStyle w:val="ListParagraph"/>
+        <w:numPr>
+          <w:ilvl w:val="0"/>
+          <w:numId w:val="1"/>
+        </w:numPr>
+        <w:shd w:val="clear" w:color="auto" w:fill="FFFFFF"/>
+        <w:spacing w:after="0" w:line="240" w:lineRule="auto"/>
+        <w:textAlignment w:val="baseline"/>
+        <w:rPr>
+          <w:rFonts w:ascii="Aptos" w:eastAsia="Times New Roman" w:hAnsi="Aptos" w:cs="Times New Roman"/>
+          <w:color w:val="000000"/>
+          <w:kern w:val="0"/>
+          <w:sz w:val="22"/>
+          <w:szCs w:val="22"/>
+          <w:lang w:eastAsia="tr-TR"/>
+          <w14:ligatures w14:val="none"/>
+        </w:rPr>
+      </w:pPr>
+      <w:r>
+        <w:rPr>
+          <w:rFonts w:ascii="Aptos" w:eastAsia="Times New Roman" w:hAnsi="Aptos" w:cs="Times New Roman"/>
+          <w:color w:val="000000"/>
+          <w:kern w:val="0"/>
+          <w:sz w:val="22"/>
+          <w:szCs w:val="22"/>
+          <w:lang w:eastAsia="tr-TR"/>
+          <w14:ligatures w14:val="none"/>
+        </w:rPr>
+        <w:t xml:space="preserve">Arşiv oluşturulabilir, istenilen ay/yıl çekilebilir. İstenilen </w:t>
+      </w:r>
+      <w:proofErr w:type="spellStart"/>
+      <w:r>
+        <w:rPr>
+          <w:rFonts w:ascii="Aptos" w:eastAsia="Times New Roman" w:hAnsi="Aptos" w:cs="Times New Roman"/>
+          <w:color w:val="000000"/>
+          <w:kern w:val="0"/>
+          <w:sz w:val="22"/>
+          <w:szCs w:val="22"/>
+          <w:lang w:eastAsia="tr-TR"/>
+          <w14:ligatures w14:val="none"/>
+        </w:rPr>
+        <w:t>random</w:t>
+      </w:r>
+      <w:proofErr w:type="spellEnd"/>
+      <w:r>
+        <w:rPr>
+          <w:rFonts w:ascii="Aptos" w:eastAsia="Times New Roman" w:hAnsi="Aptos" w:cs="Times New Roman"/>
+          <w:color w:val="000000"/>
+          <w:kern w:val="0"/>
+          <w:sz w:val="22"/>
+          <w:szCs w:val="22"/>
+          <w:lang w:eastAsia="tr-TR"/>
+          <w14:ligatures w14:val="none"/>
+        </w:rPr>
+        <w:t xml:space="preserve"> aylar karşılaştırılabilir.</w:t>
+      </w:r>
+    </w:p>
+    <w:p>
+      <w:pPr>
+        <w:pStyle w:val="ListParagraph"/>
+        <w:numPr>
+          <w:ilvl w:val="0"/>
+          <w:numId w:val="1"/>
+        </w:numPr>
+        <w:shd w:val="clear" w:color="auto" w:fill="FFFFFF"/>
+        <w:spacing w:after="0" w:line="240" w:lineRule="auto"/>
+        <w:textAlignment w:val="baseline"/>
+        <w:rPr>
+          <w:rFonts w:ascii="Aptos" w:eastAsia="Times New Roman" w:hAnsi="Aptos" w:cs="Segoe UI"/>
+          <w:color w:val="000000"/>
+          <w:kern w:val="0"/>
+          <w:sz w:val="22"/>
+          <w:szCs w:val="22"/>
+          <w:lang w:eastAsia="tr-TR"/>
+          <w14:ligatures w14:val="none"/>
+        </w:rPr>
+      </w:pPr>
+      <w:r>
+        <w:rPr>
+          <w:rFonts w:ascii="Aptos" w:eastAsia="Times New Roman" w:hAnsi="Aptos" w:cs="Segoe UI"/>
+          <w:color w:val="000000"/>
+          <w:kern w:val="0"/>
+          <w:sz w:val="22"/>
+          <w:szCs w:val="22"/>
+          <w:lang w:eastAsia="tr-TR"/>
+          <w14:ligatures w14:val="none"/>
+        </w:rPr>
+        <w:t xml:space="preserve">Proje bazında 2026 </w:t>
+      </w:r>
+      <w:proofErr w:type="spellStart"/>
+      <w:r>
+        <w:rPr>
+          <w:rFonts w:ascii="Aptos" w:eastAsia="Times New Roman" w:hAnsi="Aptos" w:cs="Segoe UI"/>
+          <w:color w:val="000000"/>
+          <w:kern w:val="0"/>
+          <w:sz w:val="22"/>
+          <w:szCs w:val="22"/>
+          <w:lang w:eastAsia="tr-TR"/>
+          <w14:ligatures w14:val="none"/>
+        </w:rPr>
+        <w:t>production</w:t>
+      </w:r>
+      <w:proofErr w:type="spellEnd"/>
+      <w:r>
+        <w:rPr>
+          <w:rFonts w:ascii="Aptos" w:eastAsia="Times New Roman" w:hAnsi="Aptos" w:cs="Segoe UI"/>
+          <w:color w:val="000000"/>
+          <w:kern w:val="0"/>
+          <w:sz w:val="22"/>
+          <w:szCs w:val="22"/>
+          <w:lang w:eastAsia="tr-TR"/>
+          <w14:ligatures w14:val="none"/>
+        </w:rPr>
+        <w:t xml:space="preserve">, </w:t>
+      </w:r>
+      <w:proofErr w:type="spellStart"/>
+      <w:r>
+        <w:rPr>
+          <w:rFonts w:ascii="Aptos" w:eastAsia="Times New Roman" w:hAnsi="Aptos" w:cs="Segoe UI"/>
+          <w:color w:val="000000"/>
+          <w:kern w:val="0"/>
+          <w:sz w:val="22"/>
+          <w:szCs w:val="22"/>
+          <w:lang w:eastAsia="tr-TR"/>
+          <w14:ligatures w14:val="none"/>
+        </w:rPr>
+        <w:t>end</w:t>
+      </w:r>
+      <w:proofErr w:type="spellEnd"/>
+      <w:r>
+        <w:rPr>
+          <w:rFonts w:ascii="Aptos" w:eastAsia="Times New Roman" w:hAnsi="Aptos" w:cs="Segoe UI"/>
+          <w:color w:val="000000"/>
+          <w:kern w:val="0"/>
+          <w:sz w:val="22"/>
+          <w:szCs w:val="22"/>
+          <w:lang w:eastAsia="tr-TR"/>
+          <w14:ligatures w14:val="none"/>
+        </w:rPr>
+        <w:t xml:space="preserve"> of 2026 </w:t>
+      </w:r>
+      <w:proofErr w:type="spellStart"/>
+      <w:r>
+        <w:rPr>
+          <w:rFonts w:ascii="Aptos" w:eastAsia="Times New Roman" w:hAnsi="Aptos" w:cs="Segoe UI"/>
+          <w:color w:val="000000"/>
+          <w:kern w:val="0"/>
+          <w:sz w:val="22"/>
+          <w:szCs w:val="22"/>
+          <w:lang w:eastAsia="tr-TR"/>
+          <w14:ligatures w14:val="none"/>
+        </w:rPr>
+        <w:t>production</w:t>
+      </w:r>
+      <w:proofErr w:type="spellEnd"/>
+      <w:r>
+        <w:rPr>
+          <w:rFonts w:ascii="Aptos" w:eastAsia="Times New Roman" w:hAnsi="Aptos" w:cs="Segoe UI"/>
+          <w:color w:val="000000"/>
+          <w:kern w:val="0"/>
+          <w:sz w:val="22"/>
+          <w:szCs w:val="22"/>
+          <w:lang w:eastAsia="tr-TR"/>
+          <w14:ligatures w14:val="none"/>
+        </w:rPr>
+        <w:t>, TD karlılıkları geçmiş ayla kıyaslanır.</w:t>
+      </w:r>
+    </w:p>
+    <w:p>
+      <w:pPr>
+        <w:pStyle w:val="ListParagraph"/>
+        <w:numPr>
+          <w:ilvl w:val="0"/>
+          <w:numId w:val="1"/>
+        </w:numPr>
+        <w:shd w:val="clear" w:color="auto" w:fill="FFFFFF"/>
+        <w:spacing w:after="0" w:line="240" w:lineRule="auto"/>
+        <w:textAlignment w:val="baseline"/>
+        <w:rPr>
+          <w:rFonts w:ascii="Aptos" w:eastAsia="Times New Roman" w:hAnsi="Aptos" w:cs="Segoe UI"/>
+          <w:color w:val="000000"/>
+          <w:kern w:val="0"/>
+          <w:sz w:val="22"/>
+          <w:szCs w:val="22"/>
+          <w:lang w:eastAsia="tr-TR"/>
+          <w14:ligatures w14:val="none"/>
+        </w:rPr>
+      </w:pPr>
+      <w:r>
+        <w:rPr>
+          <w:rFonts w:ascii="Aptos" w:eastAsia="Times New Roman" w:hAnsi="Aptos" w:cs="Segoe UI"/>
+          <w:color w:val="000000"/>
+          <w:kern w:val="0"/>
+          <w:sz w:val="22"/>
+          <w:szCs w:val="22"/>
+          <w:lang w:eastAsia="tr-TR"/>
+          <w14:ligatures w14:val="none"/>
+        </w:rPr>
+        <w:t xml:space="preserve">W/O NUC </w:t>
+      </w:r>
+      <w:proofErr w:type="spellStart"/>
+      <w:r>
+        <w:rPr>
+          <w:rFonts w:ascii="Aptos" w:eastAsia="Times New Roman" w:hAnsi="Aptos" w:cs="Segoe UI"/>
+          <w:color w:val="000000"/>
+          <w:kern w:val="0"/>
+          <w:sz w:val="22"/>
+          <w:szCs w:val="22"/>
+          <w:lang w:eastAsia="tr-TR"/>
+          <w14:ligatures w14:val="none"/>
+        </w:rPr>
+        <w:t>or</w:t>
+      </w:r>
+      <w:proofErr w:type="spellEnd"/>
+      <w:r>
+        <w:rPr>
+          <w:rFonts w:ascii="Aptos" w:eastAsia="Times New Roman" w:hAnsi="Aptos" w:cs="Segoe UI"/>
+          <w:color w:val="000000"/>
+          <w:kern w:val="0"/>
+          <w:sz w:val="22"/>
+          <w:szCs w:val="22"/>
+          <w:lang w:eastAsia="tr-TR"/>
+          <w14:ligatures w14:val="none"/>
+        </w:rPr>
+        <w:t xml:space="preserve"> </w:t>
+      </w:r>
+      <w:proofErr w:type="spellStart"/>
+      <w:r>
+        <w:rPr>
+          <w:rFonts w:ascii="Aptos" w:eastAsia="Times New Roman" w:hAnsi="Aptos" w:cs="Segoe UI"/>
+          <w:color w:val="000000"/>
+          <w:kern w:val="0"/>
+          <w:sz w:val="22"/>
+          <w:szCs w:val="22"/>
+          <w:lang w:eastAsia="tr-TR"/>
+          <w14:ligatures w14:val="none"/>
+        </w:rPr>
+        <w:t>any</w:t>
+      </w:r>
+      <w:proofErr w:type="spellEnd"/>
+      <w:r>
+        <w:rPr>
+          <w:rFonts w:ascii="Aptos" w:eastAsia="Times New Roman" w:hAnsi="Aptos" w:cs="Segoe UI"/>
+          <w:color w:val="000000"/>
+          <w:kern w:val="0"/>
+          <w:sz w:val="22"/>
+          <w:szCs w:val="22"/>
+          <w:lang w:eastAsia="tr-TR"/>
+          <w14:ligatures w14:val="none"/>
+        </w:rPr>
+        <w:t xml:space="preserve"> BU konsolide raporlar</w:t>
+      </w:r>
+    </w:p>
     <w:p/>
     <w:p/>
     <w:p/>
@@ -558,7 +879,15 @@
       </w:r>
       <w:proofErr w:type="spellEnd"/>
       <w:r>
-        <w:t xml:space="preserve"> Trend - Select </w:t>
+        <w:t xml:space="preserve"> </w:t>
+      </w:r>
+      <w:proofErr w:type="gramStart"/>
+      <w:r>
+        <w:t>Trend -</w:t>
+      </w:r>
+      <w:proofErr w:type="gramEnd"/>
+      <w:r>
+        <w:t xml:space="preserve"> Select </w:t>
       </w:r>
       <w:proofErr w:type="spellStart"/>
       <w:r>
@@ -624,6 +953,7 @@
         </w:tabs>
       </w:pPr>
       <w:r>
+        <w:lastRenderedPageBreak/>
         <w:t>2</w:t>
       </w:r>
       <w:r>
@@ -639,12 +969,17 @@
         <w:t xml:space="preserve"> </w:t>
       </w:r>
       <w:proofErr w:type="spellStart"/>
+      <w:proofErr w:type="gramStart"/>
       <w:r>
         <w:t>View</w:t>
       </w:r>
       <w:proofErr w:type="spellEnd"/>
       <w:r>
-        <w:t xml:space="preserve"> - Side-</w:t>
+        <w:t xml:space="preserve"> -</w:t>
+      </w:r>
+      <w:proofErr w:type="gramEnd"/>
+      <w:r>
+        <w:t xml:space="preserve"> Side-</w:t>
       </w:r>
       <w:proofErr w:type="spellStart"/>
       <w:r>
@@ -706,12 +1041,17 @@
         <w:t xml:space="preserve">Interactive </w:t>
       </w:r>
       <w:proofErr w:type="spellStart"/>
+      <w:proofErr w:type="gramStart"/>
       <w:r>
         <w:t>Filters</w:t>
       </w:r>
       <w:proofErr w:type="spellEnd"/>
       <w:r>
-        <w:t xml:space="preserve"> - </w:t>
+        <w:t xml:space="preserve"> -</w:t>
+      </w:r>
+      <w:proofErr w:type="gramEnd"/>
+      <w:r>
+        <w:t xml:space="preserve"> </w:t>
       </w:r>
       <w:proofErr w:type="spellStart"/>
       <w:r>
@@ -769,7 +1109,6 @@
         </w:tabs>
       </w:pPr>
       <w:r>
-        <w:lastRenderedPageBreak/>
         <w:t>4</w:t>
       </w:r>
       <w:r>
@@ -785,12 +1124,17 @@
         <w:t xml:space="preserve"> </w:t>
       </w:r>
       <w:proofErr w:type="spellStart"/>
+      <w:proofErr w:type="gramStart"/>
       <w:r>
         <w:t>Target</w:t>
       </w:r>
       <w:proofErr w:type="spellEnd"/>
       <w:r>
-        <w:t xml:space="preserve"> - </w:t>
+        <w:t xml:space="preserve"> -</w:t>
+      </w:r>
+      <w:proofErr w:type="gramEnd"/>
+      <w:r>
+        <w:t xml:space="preserve"> </w:t>
       </w:r>
       <w:proofErr w:type="spellStart"/>
       <w:r>
@@ -863,12 +1207,17 @@
         <w:t xml:space="preserve">WIP </w:t>
       </w:r>
       <w:proofErr w:type="spellStart"/>
+      <w:proofErr w:type="gramStart"/>
       <w:r>
         <w:t>Aging</w:t>
       </w:r>
       <w:proofErr w:type="spellEnd"/>
       <w:r>
-        <w:t xml:space="preserve"> - </w:t>
+        <w:t xml:space="preserve"> -</w:t>
+      </w:r>
+      <w:proofErr w:type="gramEnd"/>
+      <w:r>
+        <w:t xml:space="preserve"> </w:t>
       </w:r>
       <w:proofErr w:type="spellStart"/>
       <w:r>
@@ -954,7 +1303,15 @@
       </w:r>
       <w:proofErr w:type="spellEnd"/>
       <w:r>
-        <w:t xml:space="preserve"> Excel - </w:t>
+        <w:t xml:space="preserve"> </w:t>
+      </w:r>
+      <w:proofErr w:type="gramStart"/>
+      <w:r>
+        <w:t>Excel -</w:t>
+      </w:r>
+      <w:proofErr w:type="gramEnd"/>
+      <w:r>
+        <w:t xml:space="preserve"> </w:t>
       </w:r>
       <w:proofErr w:type="spellStart"/>
       <w:r>
@@ -970,7 +1327,15 @@
       </w:r>
       <w:proofErr w:type="spellEnd"/>
       <w:r>
-        <w:t xml:space="preserve"> data </w:t>
+        <w:t xml:space="preserve"> </w:t>
+      </w:r>
+      <w:proofErr w:type="gramStart"/>
+      <w:r>
+        <w:t>data</w:t>
+      </w:r>
+      <w:proofErr w:type="gramEnd"/>
+      <w:r>
+        <w:t xml:space="preserve"> </w:t>
       </w:r>
       <w:proofErr w:type="spellStart"/>
       <w:r>
@@ -1023,12 +1388,17 @@
         <w:t xml:space="preserve"> </w:t>
       </w:r>
       <w:proofErr w:type="spellStart"/>
+      <w:proofErr w:type="gramStart"/>
       <w:r>
         <w:t>Health</w:t>
       </w:r>
       <w:proofErr w:type="spellEnd"/>
       <w:r>
-        <w:t xml:space="preserve"> - </w:t>
+        <w:t xml:space="preserve"> -</w:t>
+      </w:r>
+      <w:proofErr w:type="gramEnd"/>
+      <w:r>
+        <w:t xml:space="preserve"> </w:t>
       </w:r>
       <w:proofErr w:type="spellStart"/>
       <w:r>
@@ -1108,12 +1478,17 @@
         <w:t xml:space="preserve"> </w:t>
       </w:r>
       <w:proofErr w:type="spellStart"/>
+      <w:proofErr w:type="gramStart"/>
       <w:r>
         <w:t>Breakdown</w:t>
       </w:r>
       <w:proofErr w:type="spellEnd"/>
       <w:r>
-        <w:t xml:space="preserve"> - WIP </w:t>
+        <w:t xml:space="preserve"> -</w:t>
+      </w:r>
+      <w:proofErr w:type="gramEnd"/>
+      <w:r>
+        <w:t xml:space="preserve"> WIP </w:t>
       </w:r>
       <w:proofErr w:type="spellStart"/>
       <w:r>
@@ -1163,12 +1538,17 @@
         <w:t xml:space="preserve">Top 10 </w:t>
       </w:r>
       <w:proofErr w:type="spellStart"/>
+      <w:proofErr w:type="gramStart"/>
       <w:r>
         <w:t>Clients</w:t>
       </w:r>
       <w:proofErr w:type="spellEnd"/>
       <w:r>
-        <w:t xml:space="preserve"> - </w:t>
+        <w:t xml:space="preserve"> -</w:t>
+      </w:r>
+      <w:proofErr w:type="gramEnd"/>
+      <w:r>
+        <w:t xml:space="preserve"> </w:t>
       </w:r>
       <w:proofErr w:type="spellStart"/>
       <w:r>
@@ -1253,12 +1633,17 @@
         <w:t xml:space="preserve"> </w:t>
       </w:r>
       <w:proofErr w:type="spellStart"/>
+      <w:proofErr w:type="gramStart"/>
       <w:r>
         <w:t>Comparison</w:t>
       </w:r>
       <w:proofErr w:type="spellEnd"/>
       <w:r>
-        <w:t xml:space="preserve"> - </w:t>
+        <w:t xml:space="preserve"> -</w:t>
+      </w:r>
+      <w:proofErr w:type="gramEnd"/>
+      <w:r>
+        <w:t xml:space="preserve"> </w:t>
       </w:r>
       <w:proofErr w:type="spellStart"/>
       <w:r>
@@ -2154,6 +2539,7 @@
   <w:style w:type="character" w:default="1" w:styleId="DefaultParagraphFont">
     <w:name w:val="Default Paragraph Font"/>
     <w:uiPriority w:val="1"/>
+    <w:semiHidden/>
     <w:unhideWhenUsed/>
   </w:style>
   <w:style w:type="table" w:default="1" w:styleId="TableNormal">

</xml_diff>